<commit_message>
Update Task 1 report: new Jira screenshots and GenAI declaration
Co-Authored-By: Claude Opus 5.5 <noreply@anthropic.com>
Claude-Session: https://claude.ai/code/session_01P339TRC8msXKjAytEqH2F5
</commit_message>
<xml_diff>
--- a/Group Project/docs/task1/COS40007_GroupTask1_AntiSpoofing.docx
+++ b/Group Project/docs/task1/COS40007_GroupTask1_AntiSpoofing.docx
@@ -11427,7 +11427,7 @@
       <w:r>
         <w:drawing>
           <wp:inline distT="0" distB="0" distL="0" distR="0">
-            <wp:extent cx="2683739" cy="3749039"/>
+            <wp:extent cx="2666737" cy="3749039"/>
             <wp:docPr id="601" name="jira_backlog"/>
             <wp:cNvGraphicFramePr>
               <a:graphicFrameLocks xmlns:a="http://schemas.openxmlformats.org/drawingml/2006/main" noChangeAspect="1"/>
@@ -11448,7 +11448,7 @@
                   <pic:spPr>
                     <a:xfrm>
                       <a:off x="0" y="0"/>
-                      <a:ext cx="2683739" cy="3749039"/>
+                      <a:ext cx="2666737" cy="3749039"/>
                     </a:xfrm>
                     <a:prstGeom prst="rect">
                       <a:avLst/>
@@ -11497,7 +11497,7 @@
       <w:r>
         <w:drawing>
           <wp:inline distT="0" distB="0" distL="0" distR="0">
-            <wp:extent cx="8229600" cy="3496283"/>
+            <wp:extent cx="8229600" cy="3512089"/>
             <wp:docPr id="602" name="jira_board"/>
             <wp:cNvGraphicFramePr>
               <a:graphicFrameLocks xmlns:a="http://schemas.openxmlformats.org/drawingml/2006/main" noChangeAspect="1"/>
@@ -11518,7 +11518,7 @@
                   <pic:spPr>
                     <a:xfrm>
                       <a:off x="0" y="0"/>
-                      <a:ext cx="8229600" cy="3496283"/>
+                      <a:ext cx="8229600" cy="3512089"/>
                     </a:xfrm>
                     <a:prstGeom prst="rect">
                       <a:avLst/>
@@ -19613,7 +19613,7 @@
           <w:sz w:val="22"/>
           <w:szCs w:val="22"/>
         </w:rPr>
-        <w:t xml:space="preserve"> (1) analysing the task brief, rubric and template; </w:t>
+        <w:t xml:space="preserve"> (1) analysing the task brief, rubric and template; (2) helping draft parts of the report and the user stories; (3) creating the system blueprint diagram and setting up the Jira backlog. The group reviewed and edited all content. </w:t>
         <w:br w:type="textWrapping"/>
         <w:t xml:space="preserve"> </w:t>
       </w:r>

</xml_diff>